<commit_message>
Add narrative report writer, variable types, and second autonomous run
Rewrote 07-report-writer agent with narrative-driven philosophy (max 12 body
figures, convergence-aware writing, curated appendices). Added variable_types.csv
for Stage 03 binning parameters. Added format_report.py for DOCX table styling.
Replaced old run (2026-03-15) with latest autonomous run (2026-03-17) including
full pipeline outputs and DOCX report.

Co-Authored-By: Claude Opus 4.6 (1M context) <noreply@anthropic.com>
</commit_message>
<xml_diff>
--- a/src/templates/doc_template.docx
+++ b/src/templates/doc_template.docx
@@ -2,279 +2,6 @@
 <file path=word/document.xml><?xml version="1.0" encoding="utf-8"?>
 <w:document xmlns:wpc="http://schemas.microsoft.com/office/word/2010/wordprocessingCanvas" xmlns:cx="http://schemas.microsoft.com/office/drawing/2014/chartex" xmlns:cx1="http://schemas.microsoft.com/office/drawing/2015/9/8/chartex" xmlns:cx2="http://schemas.microsoft.com/office/drawing/2015/10/21/chartex" xmlns:cx3="http://schemas.microsoft.com/office/drawing/2016/5/9/chartex" xmlns:cx4="http://schemas.microsoft.com/office/drawing/2016/5/10/chartex" xmlns:cx5="http://schemas.microsoft.com/office/drawing/2016/5/11/chartex" xmlns:cx6="http://schemas.microsoft.com/office/drawing/2016/5/12/chartex" xmlns:cx7="http://schemas.microsoft.com/office/drawing/2016/5/13/chartex" xmlns:cx8="http://schemas.microsoft.com/office/drawing/2016/5/14/chartex" xmlns:mc="http://schemas.openxmlformats.org/markup-compatibility/2006" xmlns:aink="http://schemas.microsoft.com/office/drawing/2016/ink" xmlns:am3d="http://schemas.microsoft.com/office/drawing/2017/model3d" xmlns:o="urn:schemas-microsoft-com:office:office" xmlns:oel="http://schemas.microsoft.com/office/2019/extlst" xmlns:r="http://schemas.openxmlformats.org/officeDocument/2006/relationships" xmlns:m="http://schemas.openxmlformats.org/officeDocument/2006/math" xmlns:v="urn:schemas-microsoft-com:vml" xmlns:wp14="http://schemas.microsoft.com/office/word/2010/wordprocessingDrawing" xmlns:wp="http://schemas.openxmlformats.org/drawingml/2006/wordprocessingDrawing" xmlns:w10="urn:schemas-microsoft-com:office:word" xmlns:w="http://schemas.openxmlformats.org/wordprocessingml/2006/main" xmlns:w14="http://schemas.microsoft.com/office/word/2010/wordml" xmlns:w15="http://schemas.microsoft.com/office/word/2012/wordml" xmlns:w16cex="http://schemas.microsoft.com/office/word/2018/wordml/cex" xmlns:w16cid="http://schemas.microsoft.com/office/word/2016/wordml/cid" xmlns:w16="http://schemas.microsoft.com/office/word/2018/wordml" xmlns:w16du="http://schemas.microsoft.com/office/word/2023/wordml/word16du" xmlns:w16sdtdh="http://schemas.microsoft.com/office/word/2020/wordml/sdtdatahash" xmlns:w16sdtfl="http://schemas.microsoft.com/office/word/2024/wordml/sdtformatlock" xmlns:w16se="http://schemas.microsoft.com/office/word/2015/wordml/symex" xmlns:wpg="http://schemas.microsoft.com/office/word/2010/wordprocessingGroup" xmlns:wpi="http://schemas.microsoft.com/office/word/2010/wordprocessingInk" xmlns:wne="http://schemas.microsoft.com/office/word/2006/wordml" xmlns:wps="http://schemas.microsoft.com/office/word/2010/wordprocessingShape" mc:Ignorable="w14 w15 w16se w16cid w16 w16cex w16sdtdh w16sdtfl w16du wp14">
   <w:body>
-    <w:p>
-      <w:pPr>
-        <w:rPr>
-          <w:rFonts w:ascii="Aptos" w:hAnsi="Aptos"/>
-        </w:rPr>
-      </w:pPr>
-    </w:p>
-    <w:p>
-      <w:pPr>
-        <w:rPr>
-          <w:rFonts w:ascii="Aptos" w:hAnsi="Aptos"/>
-        </w:rPr>
-      </w:pPr>
-    </w:p>
-    <w:p>
-      <w:pPr>
-        <w:jc w:val="center"/>
-        <w:rPr>
-          <w:rFonts w:ascii="Aptos" w:hAnsi="Aptos"/>
-          <w:sz w:val="28"/>
-          <w:szCs w:val="28"/>
-        </w:rPr>
-      </w:pPr>
-    </w:p>
-    <w:p>
-      <w:pPr>
-        <w:jc w:val="center"/>
-        <w:rPr>
-          <w:rFonts w:ascii="Aptos" w:hAnsi="Aptos"/>
-          <w:sz w:val="28"/>
-          <w:szCs w:val="28"/>
-        </w:rPr>
-      </w:pPr>
-    </w:p>
-    <w:p>
-      <w:pPr>
-        <w:jc w:val="center"/>
-        <w:rPr>
-          <w:rFonts w:ascii="Aptos" w:hAnsi="Aptos"/>
-          <w:sz w:val="28"/>
-          <w:szCs w:val="28"/>
-        </w:rPr>
-      </w:pPr>
-    </w:p>
-    <w:p>
-      <w:pPr>
-        <w:jc w:val="center"/>
-        <w:rPr>
-          <w:rFonts w:ascii="Aptos" w:hAnsi="Aptos"/>
-          <w:sz w:val="28"/>
-          <w:szCs w:val="28"/>
-        </w:rPr>
-      </w:pPr>
-    </w:p>
-    <w:p>
-      <w:pPr>
-        <w:jc w:val="center"/>
-        <w:rPr>
-          <w:rFonts w:ascii="Aptos" w:hAnsi="Aptos"/>
-          <w:sz w:val="28"/>
-          <w:szCs w:val="28"/>
-        </w:rPr>
-      </w:pPr>
-    </w:p>
-    <w:p>
-      <w:pPr>
-        <w:jc w:val="center"/>
-        <w:rPr>
-          <w:rFonts w:ascii="Aptos" w:hAnsi="Aptos"/>
-          <w:sz w:val="28"/>
-          <w:szCs w:val="28"/>
-        </w:rPr>
-      </w:pPr>
-    </w:p>
-    <w:p>
-      <w:pPr>
-        <w:jc w:val="center"/>
-        <w:rPr>
-          <w:rFonts w:ascii="Aptos" w:hAnsi="Aptos"/>
-          <w:b/>
-          <w:bCs/>
-          <w:sz w:val="28"/>
-          <w:szCs w:val="28"/>
-        </w:rPr>
-      </w:pPr>
-      <w:r>
-        <w:rPr>
-          <w:rFonts w:ascii="Aptos" w:hAnsi="Aptos"/>
-          <w:b/>
-          <w:bCs/>
-          <w:sz w:val="28"/>
-          <w:szCs w:val="28"/>
-        </w:rPr>
-        <w:t>Data Specification for [Specific Report/Process Name</w:t>
-      </w:r>
-      <w:r>
-        <w:rPr>
-          <w:rFonts w:ascii="Aptos" w:hAnsi="Aptos"/>
-          <w:b/>
-          <w:bCs/>
-          <w:sz w:val="28"/>
-          <w:szCs w:val="28"/>
-        </w:rPr>
-        <w:t>]</w:t>
-      </w:r>
-    </w:p>
-    <w:p>
-      <w:pPr>
-        <w:jc w:val="center"/>
-        <w:rPr>
-          <w:rFonts w:ascii="Aptos" w:hAnsi="Aptos"/>
-          <w:sz w:val="28"/>
-          <w:szCs w:val="28"/>
-        </w:rPr>
-      </w:pPr>
-    </w:p>
-    <w:p>
-      <w:pPr>
-        <w:jc w:val="center"/>
-        <w:rPr>
-          <w:rFonts w:ascii="Aptos" w:hAnsi="Aptos"/>
-          <w:sz w:val="28"/>
-          <w:szCs w:val="28"/>
-        </w:rPr>
-      </w:pPr>
-    </w:p>
-    <w:p>
-      <w:pPr>
-        <w:jc w:val="center"/>
-        <w:rPr>
-          <w:rFonts w:ascii="Aptos" w:hAnsi="Aptos"/>
-          <w:sz w:val="28"/>
-          <w:szCs w:val="28"/>
-        </w:rPr>
-      </w:pPr>
-    </w:p>
-    <w:p>
-      <w:pPr>
-        <w:jc w:val="center"/>
-        <w:rPr>
-          <w:rFonts w:ascii="Aptos" w:hAnsi="Aptos"/>
-          <w:sz w:val="28"/>
-          <w:szCs w:val="28"/>
-        </w:rPr>
-      </w:pPr>
-    </w:p>
-    <w:p>
-      <w:pPr>
-        <w:jc w:val="center"/>
-        <w:rPr>
-          <w:rFonts w:ascii="Aptos" w:hAnsi="Aptos"/>
-          <w:sz w:val="28"/>
-          <w:szCs w:val="28"/>
-        </w:rPr>
-      </w:pPr>
-    </w:p>
-    <w:p>
-      <w:pPr>
-        <w:jc w:val="center"/>
-        <w:rPr>
-          <w:rFonts w:ascii="Aptos" w:hAnsi="Aptos"/>
-          <w:sz w:val="28"/>
-          <w:szCs w:val="28"/>
-        </w:rPr>
-      </w:pPr>
-    </w:p>
-    <w:p>
-      <w:pPr>
-        <w:jc w:val="center"/>
-        <w:rPr>
-          <w:rFonts w:ascii="Aptos" w:hAnsi="Aptos"/>
-          <w:sz w:val="28"/>
-          <w:szCs w:val="28"/>
-        </w:rPr>
-      </w:pPr>
-    </w:p>
-    <w:p>
-      <w:pPr>
-        <w:jc w:val="center"/>
-        <w:rPr>
-          <w:rFonts w:ascii="Aptos" w:hAnsi="Aptos"/>
-          <w:sz w:val="28"/>
-          <w:szCs w:val="28"/>
-        </w:rPr>
-      </w:pPr>
-    </w:p>
-    <w:p>
-      <w:pPr>
-        <w:ind w:left="5040"/>
-        <w:rPr>
-          <w:rFonts w:ascii="Aptos" w:hAnsi="Aptos"/>
-        </w:rPr>
-      </w:pPr>
-      <w:r>
-        <w:rPr>
-          <w:rFonts w:ascii="Aptos" w:hAnsi="Aptos"/>
-        </w:rPr>
-        <w:t>Document Version: 1.0</w:t>
-      </w:r>
-      <w:r>
-        <w:rPr>
-          <w:rFonts w:ascii="Aptos" w:hAnsi="Aptos"/>
-        </w:rPr>
-        <w:br/>
-        <w:t>Date: [</w:t>
-      </w:r>
-      <w:r>
-        <w:rPr>
-          <w:rFonts w:ascii="Aptos" w:hAnsi="Aptos"/>
-          <w:highlight w:val="yellow"/>
-        </w:rPr>
-        <w:t>Date</w:t>
-      </w:r>
-      <w:r>
-        <w:rPr>
-          <w:rFonts w:ascii="Aptos" w:hAnsi="Aptos"/>
-        </w:rPr>
-        <w:t>]</w:t>
-      </w:r>
-      <w:r>
-        <w:rPr>
-          <w:rFonts w:ascii="Aptos" w:hAnsi="Aptos"/>
-        </w:rPr>
-        <w:br/>
-        <w:t>Author: [</w:t>
-      </w:r>
-      <w:r>
-        <w:rPr>
-          <w:rFonts w:ascii="Aptos" w:hAnsi="Aptos"/>
-          <w:highlight w:val="yellow"/>
-        </w:rPr>
-        <w:t>Author Name/Department</w:t>
-      </w:r>
-      <w:r>
-        <w:rPr>
-          <w:rFonts w:ascii="Aptos" w:hAnsi="Aptos"/>
-        </w:rPr>
-        <w:t>]</w:t>
-      </w:r>
-      <w:r>
-        <w:rPr>
-          <w:rFonts w:ascii="Aptos" w:hAnsi="Aptos"/>
-        </w:rPr>
-        <w:br/>
-        <w:t>Approver: [</w:t>
-      </w:r>
-      <w:r>
-        <w:rPr>
-          <w:rFonts w:ascii="Aptos" w:hAnsi="Aptos"/>
-          <w:highlight w:val="yellow"/>
-        </w:rPr>
-        <w:t>Approver Name</w:t>
-      </w:r>
-      <w:r>
-        <w:rPr>
-          <w:rFonts w:ascii="Aptos" w:hAnsi="Aptos"/>
-        </w:rPr>
-        <w:t>]</w:t>
-      </w:r>
-      <w:r>
-        <w:rPr>
-          <w:rFonts w:ascii="Aptos" w:hAnsi="Aptos"/>
-        </w:rPr>
-        <w:br/>
-      </w:r>
-    </w:p>
-    <w:p>
-      <w:pPr>
-        <w:rPr>
-          <w:rFonts w:ascii="Aptos" w:hAnsi="Aptos"/>
-        </w:rPr>
-      </w:pPr>
-    </w:p>
     <w:sdt>
       <w:sdtPr>
         <w:rPr>
@@ -739,135 +466,7 @@
         </w:p>
       </w:sdtContent>
     </w:sdt>
-    <w:p>
-      <w:pPr>
-        <w:pStyle w:val="Heading1"/>
-      </w:pPr>
-      <w:bookmarkStart w:id="0" w:name="_Toc197515316"/>
-      <w:r>
-        <w:lastRenderedPageBreak/>
-        <w:t>Introduction &amp; Scope</w:t>
-      </w:r>
-      <w:bookmarkEnd w:id="0"/>
-    </w:p>
-    <w:p>
-      <w:pPr>
-        <w:pStyle w:val="Heading2"/>
-      </w:pPr>
-      <w:bookmarkStart w:id="1" w:name="_Toc197515317"/>
-      <w:r>
-        <w:t>Purpose</w:t>
-      </w:r>
-      <w:bookmarkEnd w:id="1"/>
-    </w:p>
-    <w:p>
-      <w:pPr>
-        <w:numPr>
-          <w:ilvl w:val="0"/>
-          <w:numId w:val="6"/>
-        </w:numPr>
-        <w:rPr>
-          <w:rFonts w:ascii="Aptos" w:hAnsi="Aptos"/>
-        </w:rPr>
-      </w:pPr>
-      <w:r>
-        <w:rPr>
-          <w:rFonts w:ascii="Aptos" w:hAnsi="Aptos"/>
-        </w:rPr>
-        <w:t xml:space="preserve">This document details the specific data requirements for the [Specific Report/Process Name]. </w:t>
-      </w:r>
-    </w:p>
-    <w:p>
-      <w:pPr>
-        <w:pStyle w:val="Heading2"/>
-      </w:pPr>
-      <w:bookmarkStart w:id="2" w:name="_Toc197515318"/>
-      <w:r>
-        <w:t>Scope</w:t>
-      </w:r>
-      <w:bookmarkEnd w:id="2"/>
-    </w:p>
-    <w:p>
-      <w:pPr>
-        <w:numPr>
-          <w:ilvl w:val="0"/>
-          <w:numId w:val="6"/>
-        </w:numPr>
-        <w:rPr>
-          <w:rFonts w:ascii="Aptos" w:hAnsi="Aptos"/>
-        </w:rPr>
-      </w:pPr>
-      <w:r>
-        <w:rPr>
-          <w:rFonts w:ascii="Aptos" w:hAnsi="Aptos"/>
-        </w:rPr>
-        <w:t>This document covers the lineage for data elements deemed critical for fulfilling the requirements associated with [Specific Report/Process Name].</w:t>
-      </w:r>
-    </w:p>
-    <w:p>
-      <w:pPr>
-        <w:pStyle w:val="Heading2"/>
-      </w:pPr>
-      <w:bookmarkStart w:id="3" w:name="_Toc197515319"/>
-      <w:r>
-        <w:t>R</w:t>
-      </w:r>
-      <w:r>
-        <w:t>elevance</w:t>
-      </w:r>
-      <w:bookmarkEnd w:id="3"/>
-    </w:p>
-    <w:p>
-      <w:pPr>
-        <w:numPr>
-          <w:ilvl w:val="0"/>
-          <w:numId w:val="6"/>
-        </w:numPr>
-        <w:rPr>
-          <w:rFonts w:ascii="Aptos" w:hAnsi="Aptos"/>
-        </w:rPr>
-      </w:pPr>
-      <w:r>
-        <w:rPr>
-          <w:rFonts w:ascii="Aptos" w:hAnsi="Aptos"/>
-        </w:rPr>
-        <w:t>This lineage documentation supports:</w:t>
-      </w:r>
-    </w:p>
-    <w:p>
-      <w:pPr>
-        <w:numPr>
-          <w:ilvl w:val="1"/>
-          <w:numId w:val="6"/>
-        </w:numPr>
-        <w:rPr>
-          <w:rFonts w:ascii="Aptos" w:hAnsi="Aptos"/>
-        </w:rPr>
-      </w:pPr>
-      <w:r>
-        <w:rPr>
-          <w:rFonts w:ascii="Aptos" w:hAnsi="Aptos"/>
-        </w:rPr>
-        <w:t>Principle 2 (Data Architecture &amp; IT Infrastructure): By identifying data sources, flows, and transformation points.</w:t>
-      </w:r>
-    </w:p>
-    <w:p>
-      <w:pPr>
-        <w:numPr>
-          <w:ilvl w:val="0"/>
-          <w:numId w:val="7"/>
-        </w:numPr>
-        <w:rPr>
-          <w:rFonts w:ascii="Aptos" w:hAnsi="Aptos"/>
-        </w:rPr>
-      </w:pPr>
-      <w:r>
-        <w:rPr>
-          <w:rFonts w:ascii="Aptos" w:hAnsi="Aptos"/>
-        </w:rPr>
-        <w:t>a</w:t>
-      </w:r>
-    </w:p>
+    <w:p/>
     <w:sectPr>
       <w:pgSz w:w="11906" w:h="16838"/>
       <w:pgMar w:top="1440" w:right="1440" w:bottom="1440" w:left="1440" w:header="708" w:footer="708" w:gutter="0"/>
@@ -2971,6 +2570,14 @@
   <w:style w:type="paragraph" w:default="1" w:styleId="Normal">
     <w:name w:val="Normal"/>
     <w:qFormat/>
+    <w:pPr>
+      <w:spacing w:after="160" w:line="276" w:lineRule="auto"/>
+    </w:pPr>
+    <w:rPr>
+      <w:rFonts w:ascii="Calibri" w:hAnsi="Calibri" w:cs="Calibri"/>
+      <w:color w:val="1A1A1A"/>
+      <w:sz w:val="22"/>
+    </w:rPr>
   </w:style>
   <w:style w:type="paragraph" w:styleId="Heading1">
     <w:name w:val="heading 1"/>
@@ -2987,13 +2594,17 @@
       <w:numPr>
         <w:numId w:val="2"/>
       </w:numPr>
-      <w:spacing w:before="360" w:after="80"/>
+      <w:spacing w:before="560" w:after="240"/>
       <w:ind w:left="431" w:hanging="431"/>
       <w:outlineLvl w:val="0"/>
+      <w:pBdr>
+        <w:bottom w:val="single" w:sz="4" w:space="4" w:color="003366"/>
+      </w:pBdr>
     </w:pPr>
     <w:rPr>
-      <w:rFonts w:ascii="Aptos" w:eastAsiaTheme="majorEastAsia" w:hAnsi="Aptos" w:cstheme="majorBidi"/>
-      <w:color w:val="365F91" w:themeColor="accent1" w:themeShade="BF"/>
+      <w:rFonts w:ascii="Calibri" w:hAnsi="Calibri" w:cs="Calibri"/>
+      <w:b/>
+      <w:color w:val="003366"/>
       <w:sz w:val="40"/>
       <w:szCs w:val="40"/>
     </w:rPr>
@@ -3014,12 +2625,13 @@
         <w:ilvl w:val="1"/>
         <w:numId w:val="2"/>
       </w:numPr>
-      <w:spacing w:before="160" w:after="80"/>
+      <w:spacing w:before="400" w:after="160"/>
       <w:outlineLvl w:val="1"/>
     </w:pPr>
     <w:rPr>
-      <w:rFonts w:ascii="Aptos" w:eastAsiaTheme="majorEastAsia" w:hAnsi="Aptos" w:cstheme="majorBidi"/>
-      <w:color w:val="365F91" w:themeColor="accent1" w:themeShade="BF"/>
+      <w:rFonts w:ascii="Calibri" w:hAnsi="Calibri" w:cs="Calibri"/>
+      <w:b/>
+      <w:color w:val="003366"/>
       <w:sz w:val="32"/>
       <w:szCs w:val="32"/>
     </w:rPr>
@@ -3040,13 +2652,14 @@
         <w:ilvl w:val="2"/>
         <w:numId w:val="2"/>
       </w:numPr>
-      <w:spacing w:before="160" w:after="80"/>
+      <w:spacing w:before="280" w:after="120"/>
       <w:outlineLvl w:val="2"/>
     </w:pPr>
     <w:rPr>
-      <w:rFonts w:ascii="Aptos" w:eastAsiaTheme="majorEastAsia" w:hAnsi="Aptos" w:cstheme="majorBidi"/>
-      <w:color w:val="365F91" w:themeColor="accent1" w:themeShade="BF"/>
-      <w:sz w:val="28"/>
+      <w:rFonts w:ascii="Calibri" w:hAnsi="Calibri" w:cs="Calibri"/>
+      <w:b/>
+      <w:color w:val="003366"/>
+      <w:sz w:val="26"/>
       <w:szCs w:val="28"/>
     </w:rPr>
   </w:style>
@@ -3067,14 +2680,16 @@
         <w:ilvl w:val="3"/>
         <w:numId w:val="2"/>
       </w:numPr>
-      <w:spacing w:before="80" w:after="40"/>
+      <w:spacing w:before="200" w:after="80"/>
       <w:outlineLvl w:val="3"/>
     </w:pPr>
     <w:rPr>
-      <w:rFonts w:eastAsiaTheme="majorEastAsia" w:cstheme="majorBidi"/>
+      <w:rFonts w:ascii="Calibri" w:hAnsi="Calibri" w:cs="Calibri"/>
+      <w:b/>
       <w:i/>
       <w:iCs/>
-      <w:color w:val="365F91" w:themeColor="accent1" w:themeShade="BF"/>
+      <w:color w:val="003366"/>
+      <w:sz w:val="22"/>
     </w:rPr>
   </w:style>
   <w:style w:type="paragraph" w:styleId="Heading5">
@@ -3226,6 +2841,9 @@
         <w:right w:w="108" w:type="dxa"/>
       </w:tblCellMar>
     </w:tblPr>
+    <w:rPr>
+      <w:rFonts w:ascii="Calibri" w:hAnsi="Calibri"/>
+    </w:rPr>
   </w:style>
   <w:style w:type="numbering" w:default="1" w:styleId="NoList">
     <w:name w:val="No List"/>
@@ -3359,14 +2977,17 @@
     <w:qFormat/>
     <w:rsid w:val="003F7AFB"/>
     <w:pPr>
-      <w:spacing w:after="80" w:line="240" w:lineRule="auto"/>
+      <w:spacing w:after="120" w:line="240" w:lineRule="auto" w:before="4000"/>
       <w:contextualSpacing/>
+      <w:jc w:val="left"/>
     </w:pPr>
     <w:rPr>
-      <w:rFonts w:asciiTheme="majorHAnsi" w:eastAsiaTheme="majorEastAsia" w:hAnsiTheme="majorHAnsi" w:cstheme="majorBidi"/>
+      <w:rFonts w:ascii="Calibri" w:hAnsi="Calibri" w:cs="Calibri"/>
+      <w:b/>
+      <w:color w:val="003366"/>
       <w:spacing w:val="-10"/>
       <w:kern w:val="28"/>
-      <w:sz w:val="56"/>
+      <w:sz w:val="64"/>
       <w:szCs w:val="56"/>
     </w:rPr>
   </w:style>
@@ -3393,16 +3014,15 @@
     <w:qFormat/>
     <w:rsid w:val="003F7AFB"/>
     <w:pPr>
-      <w:numPr>
-        <w:ilvl w:val="1"/>
-      </w:numPr>
-      <w:spacing w:after="160"/>
+      <w:spacing w:after="480" w:before="0"/>
+      <w:jc w:val="left"/>
     </w:pPr>
     <w:rPr>
-      <w:rFonts w:eastAsiaTheme="majorEastAsia" w:cstheme="majorBidi"/>
-      <w:color w:val="595959" w:themeColor="text1" w:themeTint="A6"/>
+      <w:rFonts w:ascii="Calibri" w:hAnsi="Calibri"/>
+      <w:b w:val="0"/>
+      <w:color w:val="4A6F8C"/>
       <w:spacing w:val="15"/>
-      <w:sz w:val="28"/>
+      <w:sz w:val="36"/>
       <w:szCs w:val="28"/>
     </w:rPr>
   </w:style>
@@ -3430,12 +3050,18 @@
     <w:rsid w:val="003F7AFB"/>
     <w:pPr>
       <w:spacing w:before="160" w:after="160"/>
-      <w:jc w:val="center"/>
+      <w:jc w:val="left"/>
+      <w:pBdr>
+        <w:left w:val="single" w:sz="18" w:space="8" w:color="003366"/>
+      </w:pBdr>
+      <w:ind w:left="360"/>
     </w:pPr>
     <w:rPr>
+      <w:rFonts w:ascii="Calibri" w:hAnsi="Calibri"/>
       <w:i/>
       <w:iCs/>
-      <w:color w:val="404040" w:themeColor="text1" w:themeTint="BF"/>
+      <w:color w:val="003366"/>
+      <w:sz w:val="22"/>
     </w:rPr>
   </w:style>
   <w:style w:type="character" w:customStyle="1" w:styleId="QuoteChar">

</xml_diff>